<commit_message>
feat: optimize reference embedding lifecycle
</commit_message>
<xml_diff>
--- a/docs/Vision-Platform-System-Handover.docx
+++ b/docs/Vision-Platform-System-Handover.docx
@@ -2805,6 +2805,14 @@
       </w:r>
     </w:p>
     <w:p>
+      <w:r>
+        <w:rPr>
+          <w:rFonts w:ascii="Calibri" w:hAnsi="Calibri" w:eastAsia="Microsoft YaHei"/>
+        </w:rPr>
+        <w:t>标准图 Embedding 在基准创建时预先生成并以 FP16 保存。生产检测只对本次实测 ROI 提取一次 Embedding，然后在平台内与当前 ROI 的已保存向量计算相似度；只有旧基准缺少可用 Embedding 时才回退到重新编码标准图片。</w:t>
+      </w:r>
+    </w:p>
+    <w:p>
       <w:pPr>
         <w:pStyle w:val="Heading2"/>
         <w:keepNext/>
@@ -3418,6 +3426,14 @@
           <w:rFonts w:ascii="Calibri" w:hAnsi="Calibri" w:eastAsia="Microsoft YaHei"/>
         </w:rPr>
         <w:t>每个 ROI 默认最多保留 20 张活动候选图，超出后旧候选软删除。候选图不会未经确认直接污染正式基准。</w:t>
+      </w:r>
+    </w:p>
+    <w:p>
+      <w:r>
+        <w:rPr>
+          <w:rFonts w:ascii="Calibri" w:hAnsi="Calibri" w:eastAsia="Microsoft YaHei"/>
+        </w:rPr>
+        <w:t>正式基准默认最多保留 10 张。用户批准候选图时，平台先比较已保存 Embedding：近重复图片不追加；未达上限时直接加入；达到上限后，只有候选图确实增加正常外观多样性时才软停用一张高度重复旧基准。旧图片和历史记录不物理删除。</w:t>
       </w:r>
     </w:p>
     <w:p>

</xml_diff>

<commit_message>
feat: improve embedding storage and model logs
</commit_message>
<xml_diff>
--- a/docs/Vision-Platform-System-Handover.docx
+++ b/docs/Vision-Platform-System-Handover.docx
@@ -2362,7 +2362,7 @@
         <w:rPr>
           <w:rFonts w:ascii="Calibri" w:hAnsi="Calibri" w:eastAsia="Microsoft YaHei"/>
         </w:rPr>
-        <w:t>支持查看启动日志、错误日志和调用日志。</w:t>
+        <w:t>支持查看推理调用记录、运行日志和诊断日志。</w:t>
       </w:r>
     </w:p>
     <w:p>
@@ -2374,6 +2374,152 @@
           <w:rFonts w:ascii="Calibri" w:hAnsi="Calibri" w:eastAsia="Microsoft YaHei"/>
         </w:rPr>
         <w:t>日志区域可滚动并自动定位到最新内容。</w:t>
+      </w:r>
+    </w:p>
+    <w:p>
+      <w:pPr>
+        <w:pStyle w:val="ListBullet"/>
+      </w:pPr>
+      <w:r>
+        <w:rPr>
+          <w:rFonts w:ascii="Calibri" w:hAnsi="Calibri" w:eastAsia="Microsoft YaHei"/>
+        </w:rPr>
+        <w:t xml:space="preserve">新启动的模型服务通过 </w:t>
+      </w:r>
+      <w:r>
+        <w:rPr>
+          <w:rFonts w:ascii="Consolas" w:hAnsi="Consolas" w:eastAsia="Microsoft YaHei"/>
+          <w:color w:val="1F4D78"/>
+          <w:sz w:val="19"/>
+        </w:rPr>
+        <w:t>scripts/run_with_timestamped_logs.py</w:t>
+      </w:r>
+      <w:r>
+        <w:rPr>
+          <w:rFonts w:ascii="Calibri" w:hAnsi="Calibri" w:eastAsia="Microsoft YaHei"/>
+        </w:rPr>
+        <w:t xml:space="preserve"> 包装运行，运行日志和诊断日志的每一行都增加带时区的 ISO 时间，例如 </w:t>
+      </w:r>
+      <w:r>
+        <w:rPr>
+          <w:rFonts w:ascii="Consolas" w:hAnsi="Consolas" w:eastAsia="Microsoft YaHei"/>
+          <w:color w:val="1F4D78"/>
+          <w:sz w:val="19"/>
+        </w:rPr>
+        <w:t>[2026-08-21T00:58:11.256+08:00]</w:t>
+      </w:r>
+      <w:r>
+        <w:rPr>
+          <w:rFonts w:ascii="Calibri" w:hAnsi="Calibri" w:eastAsia="Microsoft YaHei"/>
+        </w:rPr>
+        <w:t>。升级前已经存在的历史行不会被改写。</w:t>
+      </w:r>
+    </w:p>
+    <w:p>
+      <w:pPr>
+        <w:pStyle w:val="ListBullet"/>
+      </w:pPr>
+      <w:r>
+        <w:rPr>
+          <w:rFonts w:ascii="Calibri" w:hAnsi="Calibri" w:eastAsia="Microsoft YaHei"/>
+          <w:b/>
+        </w:rPr>
+        <w:t>推理调用记录</w:t>
+      </w:r>
+      <w:r>
+        <w:rPr>
+          <w:rFonts w:ascii="Calibri" w:hAnsi="Calibri" w:eastAsia="Microsoft YaHei"/>
+        </w:rPr>
+        <w:t>：结构化记录模型接口请求时间、请求能力、耗时、状态和处理结果，适合追踪一次检测是否真正调用了模型。</w:t>
+      </w:r>
+    </w:p>
+    <w:p>
+      <w:pPr>
+        <w:pStyle w:val="ListBullet"/>
+      </w:pPr>
+      <w:r>
+        <w:rPr>
+          <w:rFonts w:ascii="Calibri" w:hAnsi="Calibri" w:eastAsia="Microsoft YaHei"/>
+          <w:b/>
+        </w:rPr>
+        <w:t>运行日志（正常信息）</w:t>
+      </w:r>
+      <w:r>
+        <w:rPr>
+          <w:rFonts w:ascii="Calibri" w:hAnsi="Calibri" w:eastAsia="Microsoft YaHei"/>
+        </w:rPr>
+        <w:t xml:space="preserve">：服务启动、HTTP 访问、健康检查和正常运行状态，文件后缀为 </w:t>
+      </w:r>
+      <w:r>
+        <w:rPr>
+          <w:rFonts w:ascii="Consolas" w:hAnsi="Consolas" w:eastAsia="Microsoft YaHei"/>
+          <w:color w:val="1F4D78"/>
+          <w:sz w:val="19"/>
+        </w:rPr>
+        <w:t>.out.log</w:t>
+      </w:r>
+      <w:r>
+        <w:rPr>
+          <w:rFonts w:ascii="Calibri" w:hAnsi="Calibri" w:eastAsia="Microsoft YaHei"/>
+        </w:rPr>
+        <w:t>。</w:t>
+      </w:r>
+    </w:p>
+    <w:p>
+      <w:pPr>
+        <w:pStyle w:val="ListBullet"/>
+      </w:pPr>
+      <w:r>
+        <w:rPr>
+          <w:rFonts w:ascii="Calibri" w:hAnsi="Calibri" w:eastAsia="Microsoft YaHei"/>
+          <w:b/>
+        </w:rPr>
+        <w:t>诊断日志（警告与错误）</w:t>
+      </w:r>
+      <w:r>
+        <w:rPr>
+          <w:rFonts w:ascii="Calibri" w:hAnsi="Calibri" w:eastAsia="Microsoft YaHei"/>
+        </w:rPr>
+        <w:t xml:space="preserve">：模型警告、启动异常和错误堆栈，文件后缀为 </w:t>
+      </w:r>
+      <w:r>
+        <w:rPr>
+          <w:rFonts w:ascii="Consolas" w:hAnsi="Consolas" w:eastAsia="Microsoft YaHei"/>
+          <w:color w:val="1F4D78"/>
+          <w:sz w:val="19"/>
+        </w:rPr>
+        <w:t>.error.log</w:t>
+      </w:r>
+      <w:r>
+        <w:rPr>
+          <w:rFonts w:ascii="Calibri" w:hAnsi="Calibri" w:eastAsia="Microsoft YaHei"/>
+        </w:rPr>
+        <w:t>。Uvicorn 和部分模型库会把正常启动信息写入标准错误流，因此“诊断日志有内容”不等于服务故障，最终应结合健康状态和错误堆栈判断。</w:t>
+      </w:r>
+    </w:p>
+    <w:p>
+      <w:pPr>
+        <w:pStyle w:val="ListBullet"/>
+      </w:pPr>
+      <w:r>
+        <w:rPr>
+          <w:rFonts w:ascii="Calibri" w:hAnsi="Calibri" w:eastAsia="Microsoft YaHei"/>
+        </w:rPr>
+        <w:t xml:space="preserve">日志接口响应包含 </w:t>
+      </w:r>
+      <w:r>
+        <w:rPr>
+          <w:rFonts w:ascii="Consolas" w:hAnsi="Consolas" w:eastAsia="Microsoft YaHei"/>
+          <w:color w:val="1F4D78"/>
+          <w:sz w:val="19"/>
+        </w:rPr>
+        <w:t>generated_at</w:t>
+      </w:r>
+      <w:r>
+        <w:rPr>
+          <w:rFonts w:ascii="Calibri" w:hAnsi="Calibri" w:eastAsia="Microsoft YaHei"/>
+        </w:rPr>
+        <w:t>，前端每 3 秒刷新一次并显示最近刷新时间。</w:t>
       </w:r>
     </w:p>
     <w:p>
@@ -2810,6 +2956,293 @@
           <w:rFonts w:ascii="Calibri" w:hAnsi="Calibri" w:eastAsia="Microsoft YaHei"/>
         </w:rPr>
         <w:t>标准图 Embedding 在基准创建时预先生成并以 FP16 保存。生产检测只对本次实测 ROI 提取一次 Embedding，然后在平台内与当前 ROI 的已保存向量计算相似度；只有旧基准缺少可用 Embedding 时才回退到重新编码标准图片。</w:t>
+      </w:r>
+    </w:p>
+    <w:p>
+      <w:r>
+        <w:rPr>
+          <w:rFonts w:ascii="Calibri" w:hAnsi="Calibri" w:eastAsia="Microsoft YaHei"/>
+        </w:rPr>
+        <w:t xml:space="preserve">同一 ROI 当前启用的基准向量合并为一个二维矩阵 </w:t>
+      </w:r>
+      <w:r>
+        <w:rPr>
+          <w:rFonts w:ascii="Consolas" w:hAnsi="Consolas" w:eastAsia="Microsoft YaHei"/>
+          <w:color w:val="1F4D78"/>
+          <w:sz w:val="19"/>
+        </w:rPr>
+        <w:t>embeddings.npy</w:t>
+      </w:r>
+      <w:r>
+        <w:rPr>
+          <w:rFonts w:ascii="Calibri" w:hAnsi="Calibri" w:eastAsia="Microsoft YaHei"/>
+        </w:rPr>
+        <w:t xml:space="preserve">，每一行对应一张 </w:t>
+      </w:r>
+      <w:r>
+        <w:rPr>
+          <w:rFonts w:ascii="Consolas" w:hAnsi="Consolas" w:eastAsia="Microsoft YaHei"/>
+          <w:color w:val="1F4D78"/>
+          <w:sz w:val="19"/>
+        </w:rPr>
+        <w:t>ReferenceImage</w:t>
+      </w:r>
+      <w:r>
+        <w:rPr>
+          <w:rFonts w:ascii="Calibri" w:hAnsi="Calibri" w:eastAsia="Microsoft YaHei"/>
+        </w:rPr>
+        <w:t xml:space="preserve">，数据库通过 </w:t>
+      </w:r>
+      <w:r>
+        <w:rPr>
+          <w:rFonts w:ascii="Consolas" w:hAnsi="Consolas" w:eastAsia="Microsoft YaHei"/>
+          <w:color w:val="1F4D78"/>
+          <w:sz w:val="19"/>
+        </w:rPr>
+        <w:t>embedding_index</w:t>
+      </w:r>
+      <w:r>
+        <w:rPr>
+          <w:rFonts w:ascii="Calibri" w:hAnsi="Calibri" w:eastAsia="Microsoft YaHei"/>
+        </w:rPr>
+        <w:t xml:space="preserve"> 记录行号。服务按文件修改时间和大小缓存矩阵，因此一次检测不会为 10 张基准图打开 10 个向量文件。</w:t>
+      </w:r>
+    </w:p>
+    <w:p>
+      <w:r>
+        <w:rPr>
+          <w:rFonts w:ascii="Calibri" w:hAnsi="Calibri" w:eastAsia="Microsoft YaHei"/>
+        </w:rPr>
+        <w:t>配方关联基准采用以下分层目录：</w:t>
+      </w:r>
+    </w:p>
+    <w:p>
+      <w:pPr>
+        <w:spacing w:before="80" w:after="160" w:line="252" w:lineRule="auto"/>
+        <w:ind w:left="259" w:right="259"/>
+        <w:shd w:fill="F6F8FA"/>
+      </w:pPr>
+      <w:r>
+        <w:rPr>
+          <w:rFonts w:ascii="Consolas" w:hAnsi="Consolas" w:eastAsia="Microsoft YaHei"/>
+          <w:color w:val="263238"/>
+          <w:sz w:val="17"/>
+        </w:rPr>
+        <w:t>EMBEDDING_STORAGE_ROOT/</w:t>
+        <w:br/>
+        <w:t xml:space="preserve">  LINE_{line}/MATERIAL_{material}/PROCESS_{process}/</w:t>
+        <w:br/>
+        <w:t xml:space="preserve">  CAMERA_{camera}/SHOT_{nn}/RECIPE_{id}/ROI_{id}/SET_V{version}/</w:t>
+        <w:br/>
+        <w:t xml:space="preserve">    embeddings.npy</w:t>
+        <w:br/>
+        <w:t xml:space="preserve">    manifest.json</w:t>
+      </w:r>
+    </w:p>
+    <w:p>
+      <w:r>
+        <w:rPr>
+          <w:rFonts w:ascii="Calibri" w:hAnsi="Calibri" w:eastAsia="Microsoft YaHei"/>
+        </w:rPr>
+        <w:t xml:space="preserve">没有配方上下文的通用参考组按 </w:t>
+      </w:r>
+      <w:r>
+        <w:rPr>
+          <w:rFonts w:ascii="Consolas" w:hAnsi="Consolas" w:eastAsia="Microsoft YaHei"/>
+          <w:color w:val="1F4D78"/>
+          <w:sz w:val="19"/>
+        </w:rPr>
+        <w:t>SHARD_xx/GROUP_xxxxxxxx/SET_Vxxxx</w:t>
+      </w:r>
+      <w:r>
+        <w:rPr>
+          <w:rFonts w:ascii="Calibri" w:hAnsi="Calibri" w:eastAsia="Microsoft YaHei"/>
+        </w:rPr>
+        <w:t xml:space="preserve"> 分片。数据库保存相对于 </w:t>
+      </w:r>
+      <w:r>
+        <w:rPr>
+          <w:rFonts w:ascii="Consolas" w:hAnsi="Consolas" w:eastAsia="Microsoft YaHei"/>
+          <w:color w:val="1F4D78"/>
+          <w:sz w:val="19"/>
+        </w:rPr>
+        <w:t>EMBEDDING_STORAGE_ROOT</w:t>
+      </w:r>
+      <w:r>
+        <w:rPr>
+          <w:rFonts w:ascii="Calibri" w:hAnsi="Calibri" w:eastAsia="Microsoft YaHei"/>
+        </w:rPr>
+        <w:t xml:space="preserve"> 的路径，便于从 Windows 迁移到 Linux。旧版绝对路径、单图一文件向量继续兼容读取。</w:t>
+      </w:r>
+    </w:p>
+    <w:p>
+      <w:r>
+        <w:rPr>
+          <w:rFonts w:ascii="Calibri" w:hAnsi="Calibri" w:eastAsia="Microsoft YaHei"/>
+        </w:rPr>
+        <w:t xml:space="preserve">每次活动基准集变化都会创建新的 </w:t>
+      </w:r>
+      <w:r>
+        <w:rPr>
+          <w:rFonts w:ascii="Consolas" w:hAnsi="Consolas" w:eastAsia="Microsoft YaHei"/>
+          <w:color w:val="1F4D78"/>
+          <w:sz w:val="19"/>
+        </w:rPr>
+        <w:t>SET_V</w:t>
+      </w:r>
+      <w:r>
+        <w:rPr>
+          <w:rFonts w:ascii="Calibri" w:hAnsi="Calibri" w:eastAsia="Microsoft YaHei"/>
+        </w:rPr>
+        <w:t xml:space="preserve">，先原子写入新矩阵和清单，再更新数据库；旧向量文件不自动删除。安全迁移脚本默认为只预览，只有增加 </w:t>
+      </w:r>
+      <w:r>
+        <w:rPr>
+          <w:rFonts w:ascii="Consolas" w:hAnsi="Consolas" w:eastAsia="Microsoft YaHei"/>
+          <w:color w:val="1F4D78"/>
+          <w:sz w:val="19"/>
+        </w:rPr>
+        <w:t>--apply</w:t>
+      </w:r>
+      <w:r>
+        <w:rPr>
+          <w:rFonts w:ascii="Calibri" w:hAnsi="Calibri" w:eastAsia="Microsoft YaHei"/>
+        </w:rPr>
+        <w:t xml:space="preserve"> 才更新数据库：</w:t>
+      </w:r>
+    </w:p>
+    <w:p>
+      <w:pPr>
+        <w:spacing w:before="80" w:after="160" w:line="252" w:lineRule="auto"/>
+        <w:ind w:left="259" w:right="259"/>
+        <w:shd w:fill="F6F8FA"/>
+      </w:pPr>
+      <w:r>
+        <w:rPr>
+          <w:rFonts w:ascii="Consolas" w:hAnsi="Consolas" w:eastAsia="Microsoft YaHei"/>
+          <w:color w:val="263238"/>
+          <w:sz w:val="17"/>
+        </w:rPr>
+        <w:t>.\.venv\Scripts\python.exe scripts\migrate_reference_embeddings.py</w:t>
+        <w:br/>
+        <w:t>.\.venv\Scripts\python.exe scripts\migrate_reference_embeddings.py --apply</w:t>
+      </w:r>
+    </w:p>
+    <w:p>
+      <w:r>
+        <w:rPr>
+          <w:rFonts w:ascii="Calibri" w:hAnsi="Calibri" w:eastAsia="Microsoft YaHei"/>
+        </w:rPr>
+        <w:t>生产判定不再仅取最高相似度。默认计算：</w:t>
+      </w:r>
+    </w:p>
+    <w:p>
+      <w:pPr>
+        <w:spacing w:before="80" w:after="160" w:line="252" w:lineRule="auto"/>
+        <w:ind w:left="259" w:right="259"/>
+        <w:shd w:fill="F6F8FA"/>
+      </w:pPr>
+      <w:r>
+        <w:rPr>
+          <w:rFonts w:ascii="Consolas" w:hAnsi="Consolas" w:eastAsia="Microsoft YaHei"/>
+          <w:color w:val="263238"/>
+          <w:sz w:val="17"/>
+        </w:rPr>
+        <w:t>最终稳健分数 = 0.65 × Top1 + 0.35 × Top-K 均值</w:t>
+        <w:br/>
+        <w:t>Top-K 默认取最相似的 3 张；参考图不足 3 张时使用实际数量。</w:t>
+      </w:r>
+    </w:p>
+    <w:p>
+      <w:r>
+        <w:rPr>
+          <w:rFonts w:ascii="Calibri" w:hAnsi="Calibri" w:eastAsia="Microsoft YaHei"/>
+        </w:rPr>
+        <w:t xml:space="preserve">只有一张参考图时最终分数等于 Top1，兼容现有配方。多图情况下，单张错误或偶然高度相似的参考图不能独自把结果拉到 OK。检测明细保存 </w:t>
+      </w:r>
+      <w:r>
+        <w:rPr>
+          <w:rFonts w:ascii="Consolas" w:hAnsi="Consolas" w:eastAsia="Microsoft YaHei"/>
+          <w:color w:val="1F4D78"/>
+          <w:sz w:val="19"/>
+        </w:rPr>
+        <w:t>top1_similarity</w:t>
+      </w:r>
+      <w:r>
+        <w:rPr>
+          <w:rFonts w:ascii="Calibri" w:hAnsi="Calibri" w:eastAsia="Microsoft YaHei"/>
+        </w:rPr>
+        <w:t>、</w:t>
+      </w:r>
+      <w:r>
+        <w:rPr>
+          <w:rFonts w:ascii="Consolas" w:hAnsi="Consolas" w:eastAsia="Microsoft YaHei"/>
+          <w:color w:val="1F4D78"/>
+          <w:sz w:val="19"/>
+        </w:rPr>
+        <w:t>top_k_mean</w:t>
+      </w:r>
+      <w:r>
+        <w:rPr>
+          <w:rFonts w:ascii="Calibri" w:hAnsi="Calibri" w:eastAsia="Microsoft YaHei"/>
+        </w:rPr>
+        <w:t>、</w:t>
+      </w:r>
+      <w:r>
+        <w:rPr>
+          <w:rFonts w:ascii="Consolas" w:hAnsi="Consolas" w:eastAsia="Microsoft YaHei"/>
+          <w:color w:val="1F4D78"/>
+          <w:sz w:val="19"/>
+        </w:rPr>
+        <w:t>top_k_median</w:t>
+      </w:r>
+      <w:r>
+        <w:rPr>
+          <w:rFonts w:ascii="Calibri" w:hAnsi="Calibri" w:eastAsia="Microsoft YaHei"/>
+        </w:rPr>
+        <w:t>、</w:t>
+      </w:r>
+      <w:r>
+        <w:rPr>
+          <w:rFonts w:ascii="Consolas" w:hAnsi="Consolas" w:eastAsia="Microsoft YaHei"/>
+          <w:color w:val="1F4D78"/>
+          <w:sz w:val="19"/>
+        </w:rPr>
+        <w:t>top_k_std</w:t>
+      </w:r>
+      <w:r>
+        <w:rPr>
+          <w:rFonts w:ascii="Calibri" w:hAnsi="Calibri" w:eastAsia="Microsoft YaHei"/>
+        </w:rPr>
+        <w:t xml:space="preserve">、最终 </w:t>
+      </w:r>
+      <w:r>
+        <w:rPr>
+          <w:rFonts w:ascii="Consolas" w:hAnsi="Consolas" w:eastAsia="Microsoft YaHei"/>
+          <w:color w:val="1F4D78"/>
+          <w:sz w:val="19"/>
+        </w:rPr>
+        <w:t>similarity</w:t>
+      </w:r>
+      <w:r>
+        <w:rPr>
+          <w:rFonts w:ascii="Calibri" w:hAnsi="Calibri" w:eastAsia="Microsoft YaHei"/>
+        </w:rPr>
+        <w:t xml:space="preserve"> 和参与聚合的参考图数量。阈值仍使用检测规则的 </w:t>
+      </w:r>
+      <w:r>
+        <w:rPr>
+          <w:rFonts w:ascii="Consolas" w:hAnsi="Consolas" w:eastAsia="Microsoft YaHei"/>
+          <w:color w:val="1F4D78"/>
+          <w:sz w:val="19"/>
+        </w:rPr>
+        <w:t>min_similarity</w:t>
+      </w:r>
+      <w:r>
+        <w:rPr>
+          <w:rFonts w:ascii="Calibri" w:hAnsi="Calibri" w:eastAsia="Microsoft YaHei"/>
+        </w:rPr>
+        <w:t>，因此参考图增加后应通过配方测试页面复核边界样本。</w:t>
       </w:r>
     </w:p>
     <w:p>
@@ -5187,6 +5620,8 @@
         <w:br/>
         <w:t>uploads/                   配方图、参考图、测试图、候选图</w:t>
         <w:br/>
+        <w:t>embeddings/                按业务层级保存的 ROI 向量矩阵和清单</w:t>
+        <w:br/>
         <w:t>detection_results/         ROI 裁剪图和标注结果</w:t>
         <w:br/>
         <w:t>data/                      SQLite 与模型服务 PID</w:t>
@@ -6348,6 +6783,460 @@
           </w:p>
         </w:tc>
       </w:tr>
+      <w:tr>
+        <w:tc>
+          <w:tcPr>
+            <w:tcW w:type="dxa" w:w="2000"/>
+            <w:shd w:fill="FAFBFC"/>
+            <w:vAlign w:val="center"/>
+            <w:tcMar>
+              <w:top w:w="80" w:type="dxa"/>
+              <w:bottom w:w="80" w:type="dxa"/>
+              <w:start w:w="120" w:type="dxa"/>
+              <w:end w:w="120" w:type="dxa"/>
+            </w:tcMar>
+          </w:tcPr>
+          <w:p>
+            <w:r>
+              <w:rPr>
+                <w:rFonts w:ascii="Calibri" w:hAnsi="Calibri" w:eastAsia="Microsoft YaHei"/>
+                <w:b w:val="0"/>
+                <w:sz w:val="18"/>
+              </w:rPr>
+            </w:r>
+            <w:r>
+              <w:rPr>
+                <w:rFonts w:ascii="Calibri" w:hAnsi="Calibri" w:eastAsia="Microsoft YaHei"/>
+                <w:b w:val="0"/>
+                <w:sz w:val="18"/>
+              </w:rPr>
+              <w:t>EMBEDDING_STORAGE_ROOT</w:t>
+            </w:r>
+          </w:p>
+        </w:tc>
+        <w:tc>
+          <w:tcPr>
+            <w:tcW w:type="dxa" w:w="2780"/>
+            <w:shd w:fill="FAFBFC"/>
+            <w:vAlign w:val="center"/>
+            <w:tcMar>
+              <w:top w:w="80" w:type="dxa"/>
+              <w:bottom w:w="80" w:type="dxa"/>
+              <w:start w:w="120" w:type="dxa"/>
+              <w:end w:w="120" w:type="dxa"/>
+            </w:tcMar>
+          </w:tcPr>
+          <w:p>
+            <w:r>
+              <w:rPr>
+                <w:rFonts w:ascii="Calibri" w:hAnsi="Calibri" w:eastAsia="Microsoft YaHei"/>
+                <w:b w:val="0"/>
+                <w:sz w:val="18"/>
+              </w:rPr>
+            </w:r>
+            <w:r>
+              <w:rPr>
+                <w:rFonts w:ascii="Calibri" w:hAnsi="Calibri" w:eastAsia="Microsoft YaHei"/>
+                <w:b w:val="0"/>
+                <w:sz w:val="18"/>
+              </w:rPr>
+              <w:t>./embeddings</w:t>
+            </w:r>
+          </w:p>
+        </w:tc>
+        <w:tc>
+          <w:tcPr>
+            <w:tcW w:type="dxa" w:w="4580"/>
+            <w:shd w:fill="FAFBFC"/>
+            <w:vAlign w:val="center"/>
+            <w:tcMar>
+              <w:top w:w="80" w:type="dxa"/>
+              <w:bottom w:w="80" w:type="dxa"/>
+              <w:start w:w="120" w:type="dxa"/>
+              <w:end w:w="120" w:type="dxa"/>
+            </w:tcMar>
+          </w:tcPr>
+          <w:p>
+            <w:r>
+              <w:rPr>
+                <w:rFonts w:ascii="Calibri" w:hAnsi="Calibri" w:eastAsia="Microsoft YaHei"/>
+                <w:b w:val="0"/>
+                <w:sz w:val="18"/>
+              </w:rPr>
+            </w:r>
+            <w:r>
+              <w:rPr>
+                <w:rFonts w:ascii="Calibri" w:hAnsi="Calibri" w:eastAsia="Microsoft YaHei"/>
+                <w:b w:val="0"/>
+                <w:sz w:val="18"/>
+              </w:rPr>
+              <w:t>向量矩阵根目录；Linux 建议放独立数据盘</w:t>
+            </w:r>
+          </w:p>
+        </w:tc>
+      </w:tr>
+      <w:tr>
+        <w:tc>
+          <w:tcPr>
+            <w:tcW w:type="dxa" w:w="2000"/>
+            <w:vAlign w:val="center"/>
+            <w:tcMar>
+              <w:top w:w="80" w:type="dxa"/>
+              <w:bottom w:w="80" w:type="dxa"/>
+              <w:start w:w="120" w:type="dxa"/>
+              <w:end w:w="120" w:type="dxa"/>
+            </w:tcMar>
+          </w:tcPr>
+          <w:p>
+            <w:r>
+              <w:rPr>
+                <w:rFonts w:ascii="Calibri" w:hAnsi="Calibri" w:eastAsia="Microsoft YaHei"/>
+                <w:b w:val="0"/>
+                <w:sz w:val="18"/>
+              </w:rPr>
+            </w:r>
+            <w:r>
+              <w:rPr>
+                <w:rFonts w:ascii="Calibri" w:hAnsi="Calibri" w:eastAsia="Microsoft YaHei"/>
+                <w:b w:val="0"/>
+                <w:sz w:val="18"/>
+              </w:rPr>
+              <w:t>REFERENCE_EMBEDDING_MEMORY_CACHE_SIZE</w:t>
+            </w:r>
+          </w:p>
+        </w:tc>
+        <w:tc>
+          <w:tcPr>
+            <w:tcW w:type="dxa" w:w="2780"/>
+            <w:vAlign w:val="center"/>
+            <w:tcMar>
+              <w:top w:w="80" w:type="dxa"/>
+              <w:bottom w:w="80" w:type="dxa"/>
+              <w:start w:w="120" w:type="dxa"/>
+              <w:end w:w="120" w:type="dxa"/>
+            </w:tcMar>
+          </w:tcPr>
+          <w:p>
+            <w:r>
+              <w:rPr>
+                <w:rFonts w:ascii="Calibri" w:hAnsi="Calibri" w:eastAsia="Microsoft YaHei"/>
+                <w:b w:val="0"/>
+                <w:sz w:val="18"/>
+              </w:rPr>
+            </w:r>
+            <w:r>
+              <w:rPr>
+                <w:rFonts w:ascii="Calibri" w:hAnsi="Calibri" w:eastAsia="Microsoft YaHei"/>
+                <w:b w:val="0"/>
+                <w:sz w:val="18"/>
+              </w:rPr>
+              <w:t>512</w:t>
+            </w:r>
+          </w:p>
+        </w:tc>
+        <w:tc>
+          <w:tcPr>
+            <w:tcW w:type="dxa" w:w="4580"/>
+            <w:vAlign w:val="center"/>
+            <w:tcMar>
+              <w:top w:w="80" w:type="dxa"/>
+              <w:bottom w:w="80" w:type="dxa"/>
+              <w:start w:w="120" w:type="dxa"/>
+              <w:end w:w="120" w:type="dxa"/>
+            </w:tcMar>
+          </w:tcPr>
+          <w:p>
+            <w:r>
+              <w:rPr>
+                <w:rFonts w:ascii="Calibri" w:hAnsi="Calibri" w:eastAsia="Microsoft YaHei"/>
+                <w:b w:val="0"/>
+                <w:sz w:val="18"/>
+              </w:rPr>
+            </w:r>
+            <w:r>
+              <w:rPr>
+                <w:rFonts w:ascii="Calibri" w:hAnsi="Calibri" w:eastAsia="Microsoft YaHei"/>
+                <w:b w:val="0"/>
+                <w:sz w:val="18"/>
+              </w:rPr>
+              <w:t>进程内最多缓存的向量矩阵文件数</w:t>
+            </w:r>
+          </w:p>
+        </w:tc>
+      </w:tr>
+      <w:tr>
+        <w:tc>
+          <w:tcPr>
+            <w:tcW w:type="dxa" w:w="2000"/>
+            <w:shd w:fill="FAFBFC"/>
+            <w:vAlign w:val="center"/>
+            <w:tcMar>
+              <w:top w:w="80" w:type="dxa"/>
+              <w:bottom w:w="80" w:type="dxa"/>
+              <w:start w:w="120" w:type="dxa"/>
+              <w:end w:w="120" w:type="dxa"/>
+            </w:tcMar>
+          </w:tcPr>
+          <w:p>
+            <w:r>
+              <w:rPr>
+                <w:rFonts w:ascii="Calibri" w:hAnsi="Calibri" w:eastAsia="Microsoft YaHei"/>
+                <w:b w:val="0"/>
+                <w:sz w:val="18"/>
+              </w:rPr>
+            </w:r>
+            <w:r>
+              <w:rPr>
+                <w:rFonts w:ascii="Calibri" w:hAnsi="Calibri" w:eastAsia="Microsoft YaHei"/>
+                <w:b w:val="0"/>
+                <w:sz w:val="18"/>
+              </w:rPr>
+              <w:t>REFERENCE_SIMILARITY_SCORING_MODE</w:t>
+            </w:r>
+          </w:p>
+        </w:tc>
+        <w:tc>
+          <w:tcPr>
+            <w:tcW w:type="dxa" w:w="2780"/>
+            <w:shd w:fill="FAFBFC"/>
+            <w:vAlign w:val="center"/>
+            <w:tcMar>
+              <w:top w:w="80" w:type="dxa"/>
+              <w:bottom w:w="80" w:type="dxa"/>
+              <w:start w:w="120" w:type="dxa"/>
+              <w:end w:w="120" w:type="dxa"/>
+            </w:tcMar>
+          </w:tcPr>
+          <w:p>
+            <w:r>
+              <w:rPr>
+                <w:rFonts w:ascii="Calibri" w:hAnsi="Calibri" w:eastAsia="Microsoft YaHei"/>
+                <w:b w:val="0"/>
+                <w:sz w:val="18"/>
+              </w:rPr>
+            </w:r>
+            <w:r>
+              <w:rPr>
+                <w:rFonts w:ascii="Calibri" w:hAnsi="Calibri" w:eastAsia="Microsoft YaHei"/>
+                <w:b w:val="0"/>
+                <w:sz w:val="18"/>
+              </w:rPr>
+              <w:t>ROBUST_TOP_K</w:t>
+            </w:r>
+          </w:p>
+        </w:tc>
+        <w:tc>
+          <w:tcPr>
+            <w:tcW w:type="dxa" w:w="4580"/>
+            <w:shd w:fill="FAFBFC"/>
+            <w:vAlign w:val="center"/>
+            <w:tcMar>
+              <w:top w:w="80" w:type="dxa"/>
+              <w:bottom w:w="80" w:type="dxa"/>
+              <w:start w:w="120" w:type="dxa"/>
+              <w:end w:w="120" w:type="dxa"/>
+            </w:tcMar>
+          </w:tcPr>
+          <w:p>
+            <w:r>
+              <w:rPr>
+                <w:rFonts w:ascii="Calibri" w:hAnsi="Calibri" w:eastAsia="Microsoft YaHei"/>
+                <w:b w:val="0"/>
+                <w:sz w:val="18"/>
+              </w:rPr>
+            </w:r>
+            <w:r>
+              <w:rPr>
+                <w:rFonts w:ascii="Calibri" w:hAnsi="Calibri" w:eastAsia="Microsoft YaHei"/>
+                <w:b w:val="0"/>
+                <w:sz w:val="18"/>
+              </w:rPr>
+              <w:t>相似度判定模式；兼容 TOP1、TOP_K_MEAN</w:t>
+            </w:r>
+          </w:p>
+        </w:tc>
+      </w:tr>
+      <w:tr>
+        <w:tc>
+          <w:tcPr>
+            <w:tcW w:type="dxa" w:w="2000"/>
+            <w:vAlign w:val="center"/>
+            <w:tcMar>
+              <w:top w:w="80" w:type="dxa"/>
+              <w:bottom w:w="80" w:type="dxa"/>
+              <w:start w:w="120" w:type="dxa"/>
+              <w:end w:w="120" w:type="dxa"/>
+            </w:tcMar>
+          </w:tcPr>
+          <w:p>
+            <w:r>
+              <w:rPr>
+                <w:rFonts w:ascii="Calibri" w:hAnsi="Calibri" w:eastAsia="Microsoft YaHei"/>
+                <w:b w:val="0"/>
+                <w:sz w:val="18"/>
+              </w:rPr>
+            </w:r>
+            <w:r>
+              <w:rPr>
+                <w:rFonts w:ascii="Calibri" w:hAnsi="Calibri" w:eastAsia="Microsoft YaHei"/>
+                <w:b w:val="0"/>
+                <w:sz w:val="18"/>
+              </w:rPr>
+              <w:t>REFERENCE_SIMILARITY_TOP_K</w:t>
+            </w:r>
+          </w:p>
+        </w:tc>
+        <w:tc>
+          <w:tcPr>
+            <w:tcW w:type="dxa" w:w="2780"/>
+            <w:vAlign w:val="center"/>
+            <w:tcMar>
+              <w:top w:w="80" w:type="dxa"/>
+              <w:bottom w:w="80" w:type="dxa"/>
+              <w:start w:w="120" w:type="dxa"/>
+              <w:end w:w="120" w:type="dxa"/>
+            </w:tcMar>
+          </w:tcPr>
+          <w:p>
+            <w:r>
+              <w:rPr>
+                <w:rFonts w:ascii="Calibri" w:hAnsi="Calibri" w:eastAsia="Microsoft YaHei"/>
+                <w:b w:val="0"/>
+                <w:sz w:val="18"/>
+              </w:rPr>
+            </w:r>
+            <w:r>
+              <w:rPr>
+                <w:rFonts w:ascii="Calibri" w:hAnsi="Calibri" w:eastAsia="Microsoft YaHei"/>
+                <w:b w:val="0"/>
+                <w:sz w:val="18"/>
+              </w:rPr>
+              <w:t>3</w:t>
+            </w:r>
+          </w:p>
+        </w:tc>
+        <w:tc>
+          <w:tcPr>
+            <w:tcW w:type="dxa" w:w="4580"/>
+            <w:vAlign w:val="center"/>
+            <w:tcMar>
+              <w:top w:w="80" w:type="dxa"/>
+              <w:bottom w:w="80" w:type="dxa"/>
+              <w:start w:w="120" w:type="dxa"/>
+              <w:end w:w="120" w:type="dxa"/>
+            </w:tcMar>
+          </w:tcPr>
+          <w:p>
+            <w:r>
+              <w:rPr>
+                <w:rFonts w:ascii="Calibri" w:hAnsi="Calibri" w:eastAsia="Microsoft YaHei"/>
+                <w:b w:val="0"/>
+                <w:sz w:val="18"/>
+              </w:rPr>
+            </w:r>
+            <w:r>
+              <w:rPr>
+                <w:rFonts w:ascii="Calibri" w:hAnsi="Calibri" w:eastAsia="Microsoft YaHei"/>
+                <w:b w:val="0"/>
+                <w:sz w:val="18"/>
+              </w:rPr>
+              <w:t>稳健评分参与聚合的最相似参考图数量</w:t>
+            </w:r>
+          </w:p>
+        </w:tc>
+      </w:tr>
+      <w:tr>
+        <w:tc>
+          <w:tcPr>
+            <w:tcW w:type="dxa" w:w="2000"/>
+            <w:shd w:fill="FAFBFC"/>
+            <w:vAlign w:val="center"/>
+            <w:tcMar>
+              <w:top w:w="80" w:type="dxa"/>
+              <w:bottom w:w="80" w:type="dxa"/>
+              <w:start w:w="120" w:type="dxa"/>
+              <w:end w:w="120" w:type="dxa"/>
+            </w:tcMar>
+          </w:tcPr>
+          <w:p>
+            <w:r>
+              <w:rPr>
+                <w:rFonts w:ascii="Calibri" w:hAnsi="Calibri" w:eastAsia="Microsoft YaHei"/>
+                <w:b w:val="0"/>
+                <w:sz w:val="18"/>
+              </w:rPr>
+            </w:r>
+            <w:r>
+              <w:rPr>
+                <w:rFonts w:ascii="Calibri" w:hAnsi="Calibri" w:eastAsia="Microsoft YaHei"/>
+                <w:b w:val="0"/>
+                <w:sz w:val="18"/>
+              </w:rPr>
+              <w:t>REFERENCE_SIMILARITY_TOP1_WEIGHT</w:t>
+            </w:r>
+          </w:p>
+        </w:tc>
+        <w:tc>
+          <w:tcPr>
+            <w:tcW w:type="dxa" w:w="2780"/>
+            <w:shd w:fill="FAFBFC"/>
+            <w:vAlign w:val="center"/>
+            <w:tcMar>
+              <w:top w:w="80" w:type="dxa"/>
+              <w:bottom w:w="80" w:type="dxa"/>
+              <w:start w:w="120" w:type="dxa"/>
+              <w:end w:w="120" w:type="dxa"/>
+            </w:tcMar>
+          </w:tcPr>
+          <w:p>
+            <w:r>
+              <w:rPr>
+                <w:rFonts w:ascii="Calibri" w:hAnsi="Calibri" w:eastAsia="Microsoft YaHei"/>
+                <w:b w:val="0"/>
+                <w:sz w:val="18"/>
+              </w:rPr>
+            </w:r>
+            <w:r>
+              <w:rPr>
+                <w:rFonts w:ascii="Calibri" w:hAnsi="Calibri" w:eastAsia="Microsoft YaHei"/>
+                <w:b w:val="0"/>
+                <w:sz w:val="18"/>
+              </w:rPr>
+              <w:t>0.65</w:t>
+            </w:r>
+          </w:p>
+        </w:tc>
+        <w:tc>
+          <w:tcPr>
+            <w:tcW w:type="dxa" w:w="4580"/>
+            <w:shd w:fill="FAFBFC"/>
+            <w:vAlign w:val="center"/>
+            <w:tcMar>
+              <w:top w:w="80" w:type="dxa"/>
+              <w:bottom w:w="80" w:type="dxa"/>
+              <w:start w:w="120" w:type="dxa"/>
+              <w:end w:w="120" w:type="dxa"/>
+            </w:tcMar>
+          </w:tcPr>
+          <w:p>
+            <w:r>
+              <w:rPr>
+                <w:rFonts w:ascii="Calibri" w:hAnsi="Calibri" w:eastAsia="Microsoft YaHei"/>
+                <w:b w:val="0"/>
+                <w:sz w:val="18"/>
+              </w:rPr>
+            </w:r>
+            <w:r>
+              <w:rPr>
+                <w:rFonts w:ascii="Calibri" w:hAnsi="Calibri" w:eastAsia="Microsoft YaHei"/>
+                <w:b w:val="0"/>
+                <w:sz w:val="18"/>
+              </w:rPr>
+              <w:t>最相似参考图在稳健评分中的权重</w:t>
+            </w:r>
+          </w:p>
+        </w:tc>
+      </w:tr>
     </w:tbl>
     <w:p>
       <w:pPr>
@@ -6700,7 +7589,7 @@
         <w:rPr>
           <w:rFonts w:ascii="Calibri" w:hAnsi="Calibri" w:eastAsia="Microsoft YaHei"/>
         </w:rPr>
-        <w:t>当前测试共 47 项，覆盖：</w:t>
+        <w:t>当前桌面项目测试共 55 项，覆盖：</w:t>
       </w:r>
     </w:p>
     <w:p>
@@ -8099,6 +8988,38 @@
     </w:p>
     <w:p>
       <w:pPr>
+        <w:pStyle w:val="Heading2"/>
+        <w:keepNext/>
+        <w:keepLines/>
+      </w:pPr>
+      <w:r>
+        <w:t>21.9 日志增长与敏感信息</w:t>
+      </w:r>
+    </w:p>
+    <w:p>
+      <w:r>
+        <w:rPr>
+          <w:rFonts w:ascii="Calibri" w:hAnsi="Calibri" w:eastAsia="Microsoft YaHei"/>
+        </w:rPr>
+        <w:t xml:space="preserve">当前模型日志持续追加写入，尚未实现按大小或日期自动轮转。Linux 生产部署应使用 </w:t>
+      </w:r>
+      <w:r>
+        <w:rPr>
+          <w:rFonts w:ascii="Consolas" w:hAnsi="Consolas" w:eastAsia="Microsoft YaHei"/>
+          <w:color w:val="1F4D78"/>
+          <w:sz w:val="19"/>
+        </w:rPr>
+        <w:t>logrotate</w:t>
+      </w:r>
+      <w:r>
+        <w:rPr>
+          <w:rFonts w:ascii="Calibri" w:hAnsi="Calibri" w:eastAsia="Microsoft YaHei"/>
+        </w:rPr>
+        <w:t xml:space="preserve"> 或 systemd journal 控制保留周期，并限制日志目录权限。调用日志可能包含图片路径、产品信息和错误上下文，不应直接上传公共仓库，也不应向普通用户展示未经脱敏的完整请求。</w:t>
+      </w:r>
+    </w:p>
+    <w:p>
+      <w:pPr>
         <w:pStyle w:val="Heading1"/>
         <w:keepNext/>
         <w:keepLines/>
@@ -8230,7 +9151,7 @@
         <w:rPr>
           <w:rFonts w:ascii="Calibri" w:hAnsi="Calibri" w:eastAsia="Microsoft YaHei"/>
         </w:rPr>
-        <w:t>：Prometheus 指标、GPU 利用率、模型延迟、错误率和候选积压。</w:t>
+        <w:t>：Prometheus 指标、GPU 利用率、模型延迟、错误率、候选积压和日志轮转。</w:t>
       </w:r>
     </w:p>
     <w:p>
@@ -8508,7 +9429,41 @@
         <w:rPr>
           <w:rFonts w:ascii="Calibri" w:hAnsi="Calibri" w:eastAsia="Microsoft YaHei"/>
         </w:rPr>
-        <w:t>47 项单元测试全部通过。</w:t>
+        <w:t xml:space="preserve">模型服务重启后，运行日志和诊断日志的新行均带 </w:t>
+      </w:r>
+      <w:r>
+        <w:rPr>
+          <w:rFonts w:ascii="Consolas" w:hAnsi="Consolas" w:eastAsia="Microsoft YaHei"/>
+          <w:color w:val="1F4D78"/>
+          <w:sz w:val="19"/>
+        </w:rPr>
+        <w:t>+08:00</w:t>
+      </w:r>
+      <w:r>
+        <w:rPr>
+          <w:rFonts w:ascii="Calibri" w:hAnsi="Calibri" w:eastAsia="Microsoft YaHei"/>
+        </w:rPr>
+        <w:t xml:space="preserve"> 时间戳。</w:t>
+      </w:r>
+    </w:p>
+    <w:p>
+      <w:pPr>
+        <w:spacing w:after="80"/>
+        <w:ind w:left="259"/>
+      </w:pPr>
+      <w:r>
+        <w:rPr>
+          <w:rFonts w:ascii="Calibri" w:hAnsi="Calibri" w:eastAsia="Microsoft YaHei"/>
+          <w:color w:val="2E74B5"/>
+          <w:sz w:val="22"/>
+        </w:rPr>
+        <w:t xml:space="preserve">☐ </w:t>
+      </w:r>
+      <w:r>
+        <w:rPr>
+          <w:rFonts w:ascii="Calibri" w:hAnsi="Calibri" w:eastAsia="Microsoft YaHei"/>
+        </w:rPr>
+        <w:t>56 项单元测试全部通过。</w:t>
       </w:r>
     </w:p>
     <w:p>
@@ -9256,6 +10211,130 @@
                 <w:sz w:val="18"/>
               </w:rPr>
               <w:t>app/services/model_service_manager.py</w:t>
+            </w:r>
+          </w:p>
+        </w:tc>
+      </w:tr>
+      <w:tr>
+        <w:tc>
+          <w:tcPr>
+            <w:tcW w:type="dxa" w:w="2700"/>
+            <w:vAlign w:val="center"/>
+            <w:tcMar>
+              <w:top w:w="80" w:type="dxa"/>
+              <w:bottom w:w="80" w:type="dxa"/>
+              <w:start w:w="120" w:type="dxa"/>
+              <w:end w:w="120" w:type="dxa"/>
+            </w:tcMar>
+          </w:tcPr>
+          <w:p>
+            <w:r>
+              <w:rPr>
+                <w:rFonts w:ascii="Calibri" w:hAnsi="Calibri" w:eastAsia="Microsoft YaHei"/>
+                <w:b w:val="0"/>
+                <w:sz w:val="18"/>
+              </w:rPr>
+            </w:r>
+            <w:r>
+              <w:rPr>
+                <w:rFonts w:ascii="Calibri" w:hAnsi="Calibri" w:eastAsia="Microsoft YaHei"/>
+                <w:b w:val="0"/>
+                <w:sz w:val="18"/>
+              </w:rPr>
+              <w:t>模型日志时间戳包装器</w:t>
+            </w:r>
+          </w:p>
+        </w:tc>
+        <w:tc>
+          <w:tcPr>
+            <w:tcW w:type="dxa" w:w="6660"/>
+            <w:vAlign w:val="center"/>
+            <w:tcMar>
+              <w:top w:w="80" w:type="dxa"/>
+              <w:bottom w:w="80" w:type="dxa"/>
+              <w:start w:w="120" w:type="dxa"/>
+              <w:end w:w="120" w:type="dxa"/>
+            </w:tcMar>
+          </w:tcPr>
+          <w:p>
+            <w:r>
+              <w:rPr>
+                <w:rFonts w:ascii="Calibri" w:hAnsi="Calibri" w:eastAsia="Microsoft YaHei"/>
+                <w:b w:val="0"/>
+                <w:sz w:val="18"/>
+              </w:rPr>
+            </w:r>
+            <w:r>
+              <w:rPr>
+                <w:rFonts w:ascii="Calibri" w:hAnsi="Calibri" w:eastAsia="Microsoft YaHei"/>
+                <w:b w:val="0"/>
+                <w:color w:val="1F4D78"/>
+                <w:sz w:val="18"/>
+              </w:rPr>
+              <w:t>scripts/run_with_timestamped_logs.py</w:t>
+            </w:r>
+          </w:p>
+        </w:tc>
+      </w:tr>
+      <w:tr>
+        <w:tc>
+          <w:tcPr>
+            <w:tcW w:type="dxa" w:w="2700"/>
+            <w:shd w:fill="FAFBFC"/>
+            <w:vAlign w:val="center"/>
+            <w:tcMar>
+              <w:top w:w="80" w:type="dxa"/>
+              <w:bottom w:w="80" w:type="dxa"/>
+              <w:start w:w="120" w:type="dxa"/>
+              <w:end w:w="120" w:type="dxa"/>
+            </w:tcMar>
+          </w:tcPr>
+          <w:p>
+            <w:r>
+              <w:rPr>
+                <w:rFonts w:ascii="Calibri" w:hAnsi="Calibri" w:eastAsia="Microsoft YaHei"/>
+                <w:b w:val="0"/>
+                <w:sz w:val="18"/>
+              </w:rPr>
+            </w:r>
+            <w:r>
+              <w:rPr>
+                <w:rFonts w:ascii="Calibri" w:hAnsi="Calibri" w:eastAsia="Microsoft YaHei"/>
+                <w:b w:val="0"/>
+                <w:sz w:val="18"/>
+              </w:rPr>
+              <w:t>向量存储迁移脚本</w:t>
+            </w:r>
+          </w:p>
+        </w:tc>
+        <w:tc>
+          <w:tcPr>
+            <w:tcW w:type="dxa" w:w="6660"/>
+            <w:shd w:fill="FAFBFC"/>
+            <w:vAlign w:val="center"/>
+            <w:tcMar>
+              <w:top w:w="80" w:type="dxa"/>
+              <w:bottom w:w="80" w:type="dxa"/>
+              <w:start w:w="120" w:type="dxa"/>
+              <w:end w:w="120" w:type="dxa"/>
+            </w:tcMar>
+          </w:tcPr>
+          <w:p>
+            <w:r>
+              <w:rPr>
+                <w:rFonts w:ascii="Calibri" w:hAnsi="Calibri" w:eastAsia="Microsoft YaHei"/>
+                <w:b w:val="0"/>
+                <w:sz w:val="18"/>
+              </w:rPr>
+            </w:r>
+            <w:r>
+              <w:rPr>
+                <w:rFonts w:ascii="Calibri" w:hAnsi="Calibri" w:eastAsia="Microsoft YaHei"/>
+                <w:b w:val="0"/>
+                <w:color w:val="1F4D78"/>
+                <w:sz w:val="18"/>
+              </w:rPr>
+              <w:t>scripts/migrate_reference_embeddings.py</w:t>
             </w:r>
           </w:p>
         </w:tc>

</xml_diff>